<commit_message>
Relatório Crítica 2x2: produtividade do mapa SIGESPOL (01/08 a 16/10/2026)
Co-Authored-By: Claude Opus 5.5 <noreply@anthropic.com>
Claude-Session: https://claude.ai/code/session_01JFjYnqJFVAR9FVH6t9NxKg
</commit_message>
<xml_diff>
--- a/relatorio/RELATORIO_CRITICA_Operacao_2x2_ago-set-out_2026.docx
+++ b/relatorio/RELATORIO_CRITICA_Operacao_2x2_ago-set-out_2026.docx
@@ -4107,6 +4107,7 @@
           </w:tcPr>
           <w:p>
             <w:pPr>
+              <w:ind w:firstLine="0" w:left="0"/>
               <w:jc w:val="center"/>
               <w:rPr>
                 <w:rFonts w:ascii="Calibri" w:hAnsi="Calibri" w:cs="Arial"/>
@@ -4122,7 +4123,7 @@
                 <w:sz w:val="18"/>
                 <w:szCs w:val="18"/>
               </w:rPr>
-              <w:t>99</w:t>
+              <w:t>83</w:t>
             </w:r>
             <w:r>
               <w:rPr>
@@ -4150,7 +4151,8 @@
           </w:tcPr>
           <w:p>
             <w:pPr>
-              <w:jc w:val="right"/>
+              <w:ind w:firstLine="0" w:left="0"/>
+              <w:jc w:val="center"/>
               <w:rPr>
                 <w:rFonts w:ascii="Calibri" w:hAnsi="Calibri" w:cs="Arial"/>
                 <w:color w:val="000000" w:themeColor="text1"/>
@@ -4158,6 +4160,15 @@
                 <w:szCs w:val="18"/>
               </w:rPr>
             </w:pPr>
+            <w:r>
+              <w:rPr>
+                <w:rFonts w:ascii="Calibri" w:hAnsi="Calibri" w:cs="Arial"/>
+                <w:color w:val="000000" w:themeColor="text1"/>
+                <w:sz w:val="18"/>
+                <w:szCs w:val="18"/>
+              </w:rPr>
+              <w:t>0</w:t>
+            </w:r>
           </w:p>
         </w:tc>
         <w:tc>
@@ -4175,6 +4186,7 @@
           </w:tcPr>
           <w:p>
             <w:pPr>
+              <w:ind w:firstLine="0" w:left="0"/>
               <w:jc w:val="center"/>
               <w:rPr>
                 <w:rFonts w:ascii="Calibri" w:hAnsi="Calibri" w:cs="Arial"/>
@@ -4190,7 +4202,7 @@
                 <w:sz w:val="18"/>
                 <w:szCs w:val="18"/>
               </w:rPr>
-              <w:t/>
+              <w:t>68</w:t>
             </w:r>
           </w:p>
         </w:tc>
@@ -4209,7 +4221,8 @@
           </w:tcPr>
           <w:p>
             <w:pPr>
-              <w:jc w:val="right"/>
+              <w:ind w:firstLine="0" w:left="0"/>
+              <w:jc w:val="center"/>
               <w:rPr>
                 <w:rFonts w:ascii="Calibri" w:hAnsi="Calibri" w:cs="Arial"/>
                 <w:color w:val="000000" w:themeColor="text1"/>
@@ -4217,6 +4230,15 @@
                 <w:szCs w:val="18"/>
               </w:rPr>
             </w:pPr>
+            <w:r>
+              <w:rPr>
+                <w:rFonts w:ascii="Calibri" w:hAnsi="Calibri" w:cs="Arial"/>
+                <w:color w:val="000000" w:themeColor="text1"/>
+                <w:sz w:val="18"/>
+                <w:szCs w:val="18"/>
+              </w:rPr>
+              <w:t>0</w:t>
+            </w:r>
           </w:p>
         </w:tc>
         <w:tc>
@@ -4234,7 +4256,8 @@
           </w:tcPr>
           <w:p>
             <w:pPr>
-              <w:jc w:val="right"/>
+              <w:ind w:firstLine="0" w:left="0"/>
+              <w:jc w:val="center"/>
               <w:rPr>
                 <w:rFonts w:ascii="Calibri" w:hAnsi="Calibri" w:cs="Arial"/>
                 <w:color w:val="000000" w:themeColor="text1"/>
@@ -4242,6 +4265,15 @@
                 <w:szCs w:val="18"/>
               </w:rPr>
             </w:pPr>
+            <w:r>
+              <w:rPr>
+                <w:rFonts w:ascii="Calibri" w:hAnsi="Calibri" w:cs="Arial"/>
+                <w:color w:val="000000" w:themeColor="text1"/>
+                <w:sz w:val="18"/>
+                <w:szCs w:val="18"/>
+              </w:rPr>
+              <w:t>0</w:t>
+            </w:r>
           </w:p>
         </w:tc>
         <w:tc>
@@ -4259,7 +4291,8 @@
           </w:tcPr>
           <w:p>
             <w:pPr>
-              <w:jc w:val="right"/>
+              <w:ind w:firstLine="0" w:left="0"/>
+              <w:jc w:val="center"/>
               <w:rPr>
                 <w:rFonts w:ascii="Calibri" w:hAnsi="Calibri" w:cs="Arial"/>
                 <w:color w:val="000000" w:themeColor="text1"/>
@@ -4267,6 +4300,15 @@
                 <w:szCs w:val="18"/>
               </w:rPr>
             </w:pPr>
+            <w:r>
+              <w:rPr>
+                <w:rFonts w:ascii="Calibri" w:hAnsi="Calibri" w:cs="Arial"/>
+                <w:color w:val="000000" w:themeColor="text1"/>
+                <w:sz w:val="18"/>
+                <w:szCs w:val="18"/>
+              </w:rPr>
+              <w:t>0</w:t>
+            </w:r>
           </w:p>
         </w:tc>
         <w:tc>
@@ -4284,6 +4326,7 @@
           </w:tcPr>
           <w:p>
             <w:pPr>
+              <w:ind w:firstLine="0" w:left="0"/>
               <w:jc w:val="center"/>
               <w:rPr>
                 <w:rFonts w:ascii="Calibri" w:hAnsi="Calibri" w:cs="Arial"/>
@@ -4299,7 +4342,7 @@
                 <w:sz w:val="18"/>
                 <w:szCs w:val="18"/>
               </w:rPr>
-              <w:t/>
+              <w:t>768</w:t>
             </w:r>
           </w:p>
         </w:tc>
@@ -4318,6 +4361,7 @@
           </w:tcPr>
           <w:p>
             <w:pPr>
+              <w:ind w:firstLine="0" w:left="0"/>
               <w:jc w:val="center"/>
               <w:rPr>
                 <w:rFonts w:ascii="Calibri" w:hAnsi="Calibri" w:cs="Arial"/>
@@ -4335,7 +4379,7 @@
                 <w:szCs w:val="18"/>
                 <w:lang w:val="en-US"/>
               </w:rPr>
-              <w:t/>
+              <w:t>43</w:t>
             </w:r>
             <w:r>
               <w:rPr>
@@ -4364,7 +4408,8 @@
           </w:tcPr>
           <w:p>
             <w:pPr>
-              <w:jc w:val="right"/>
+              <w:ind w:firstLine="0" w:left="0"/>
+              <w:jc w:val="center"/>
               <w:rPr>
                 <w:rFonts w:ascii="Calibri" w:hAnsi="Calibri" w:cs="Arial"/>
                 <w:color w:val="000000" w:themeColor="text1"/>
@@ -4372,6 +4417,15 @@
                 <w:szCs w:val="18"/>
               </w:rPr>
             </w:pPr>
+            <w:r>
+              <w:rPr>
+                <w:rFonts w:ascii="Calibri" w:hAnsi="Calibri" w:cs="Arial"/>
+                <w:color w:val="000000" w:themeColor="text1"/>
+                <w:sz w:val="18"/>
+                <w:szCs w:val="18"/>
+              </w:rPr>
+              <w:t>0</w:t>
+            </w:r>
           </w:p>
         </w:tc>
         <w:tc>
@@ -4389,6 +4443,7 @@
           </w:tcPr>
           <w:p>
             <w:pPr>
+              <w:ind w:firstLine="0" w:left="0"/>
               <w:jc w:val="center"/>
               <w:rPr>
                 <w:rFonts w:ascii="Calibri" w:hAnsi="Calibri" w:cs="Arial"/>
@@ -4404,7 +4459,7 @@
                 <w:sz w:val="18"/>
                 <w:szCs w:val="18"/>
               </w:rPr>
-              <w:t/>
+              <w:t>54</w:t>
             </w:r>
             <w:r>
               <w:rPr>
@@ -4432,6 +4487,7 @@
           </w:tcPr>
           <w:p>
             <w:pPr>
+              <w:ind w:firstLine="0" w:left="0"/>
               <w:jc w:val="center"/>
               <w:rPr>
                 <w:rFonts w:ascii="Calibri" w:hAnsi="Calibri" w:cs="Arial"/>
@@ -4447,7 +4503,7 @@
                 <w:sz w:val="18"/>
                 <w:szCs w:val="18"/>
               </w:rPr>
-              <w:t/>
+              <w:t>306</w:t>
             </w:r>
             <w:r>
               <w:rPr>
@@ -4475,7 +4531,8 @@
           </w:tcPr>
           <w:p>
             <w:pPr>
-              <w:jc w:val="right"/>
+              <w:ind w:firstLine="0" w:left="0"/>
+              <w:jc w:val="center"/>
               <w:rPr>
                 <w:rFonts w:ascii="Calibri" w:hAnsi="Calibri" w:cs="Arial"/>
                 <w:color w:val="000000" w:themeColor="text1"/>
@@ -4483,6 +4540,15 @@
                 <w:szCs w:val="18"/>
               </w:rPr>
             </w:pPr>
+            <w:r>
+              <w:rPr>
+                <w:rFonts w:ascii="Calibri" w:hAnsi="Calibri" w:cs="Arial"/>
+                <w:color w:val="000000" w:themeColor="text1"/>
+                <w:sz w:val="18"/>
+                <w:szCs w:val="18"/>
+              </w:rPr>
+              <w:t>0</w:t>
+            </w:r>
           </w:p>
         </w:tc>
         <w:tc>
@@ -4500,7 +4566,8 @@
           </w:tcPr>
           <w:p>
             <w:pPr>
-              <w:jc w:val="right"/>
+              <w:ind w:firstLine="0" w:left="0"/>
+              <w:jc w:val="center"/>
               <w:rPr>
                 <w:rFonts w:ascii="Calibri" w:hAnsi="Calibri" w:cs="Arial"/>
                 <w:color w:val="000000" w:themeColor="text1"/>
@@ -4508,6 +4575,15 @@
                 <w:szCs w:val="18"/>
               </w:rPr>
             </w:pPr>
+            <w:r>
+              <w:rPr>
+                <w:rFonts w:ascii="Calibri" w:hAnsi="Calibri" w:cs="Arial"/>
+                <w:color w:val="000000" w:themeColor="text1"/>
+                <w:sz w:val="18"/>
+                <w:szCs w:val="18"/>
+              </w:rPr>
+              <w:t>0</w:t>
+            </w:r>
           </w:p>
         </w:tc>
         <w:tc>
@@ -4525,6 +4601,7 @@
           </w:tcPr>
           <w:p>
             <w:pPr>
+              <w:ind w:firstLine="0" w:left="0"/>
               <w:jc w:val="center"/>
               <w:rPr>
                 <w:rFonts w:ascii="Calibri" w:hAnsi="Calibri" w:cs="Arial"/>
@@ -4533,6 +4610,15 @@
                 <w:szCs w:val="18"/>
               </w:rPr>
             </w:pPr>
+            <w:r>
+              <w:rPr>
+                <w:rFonts w:ascii="Calibri" w:hAnsi="Calibri" w:cs="Arial"/>
+                <w:color w:val="000000" w:themeColor="text1"/>
+                <w:sz w:val="18"/>
+                <w:szCs w:val="18"/>
+              </w:rPr>
+              <w:t>1</w:t>
+            </w:r>
           </w:p>
         </w:tc>
         <w:tc>
@@ -4550,6 +4636,7 @@
           </w:tcPr>
           <w:p>
             <w:pPr>
+              <w:ind w:firstLine="0" w:left="0"/>
               <w:jc w:val="center"/>
               <w:rPr>
                 <w:rFonts w:ascii="Calibri" w:hAnsi="Calibri" w:cs="Arial"/>
@@ -4558,6 +4645,15 @@
                 <w:szCs w:val="18"/>
               </w:rPr>
             </w:pPr>
+            <w:r>
+              <w:rPr>
+                <w:rFonts w:ascii="Calibri" w:hAnsi="Calibri" w:cs="Arial"/>
+                <w:color w:val="000000" w:themeColor="text1"/>
+                <w:sz w:val="18"/>
+                <w:szCs w:val="18"/>
+              </w:rPr>
+              <w:t>1</w:t>
+            </w:r>
           </w:p>
         </w:tc>
         <w:tc>
@@ -4575,7 +4671,8 @@
           </w:tcPr>
           <w:p>
             <w:pPr>
-              <w:jc w:val="right"/>
+              <w:ind w:firstLine="0" w:left="0"/>
+              <w:jc w:val="center"/>
               <w:rPr>
                 <w:rFonts w:ascii="Calibri" w:hAnsi="Calibri" w:cs="Arial"/>
                 <w:color w:val="000000" w:themeColor="text1"/>
@@ -4583,6 +4680,15 @@
                 <w:szCs w:val="18"/>
               </w:rPr>
             </w:pPr>
+            <w:r>
+              <w:rPr>
+                <w:rFonts w:ascii="Calibri" w:hAnsi="Calibri" w:cs="Arial"/>
+                <w:color w:val="000000" w:themeColor="text1"/>
+                <w:sz w:val="18"/>
+                <w:szCs w:val="18"/>
+              </w:rPr>
+              <w:t>0</w:t>
+            </w:r>
           </w:p>
         </w:tc>
         <w:tc>
@@ -4600,6 +4706,7 @@
           </w:tcPr>
           <w:p>
             <w:pPr>
+              <w:ind w:firstLine="0" w:left="0"/>
               <w:jc w:val="center"/>
               <w:rPr>
                 <w:rFonts w:ascii="Calibri" w:hAnsi="Calibri" w:cs="Arial"/>
@@ -4608,6 +4715,15 @@
                 <w:szCs w:val="18"/>
               </w:rPr>
             </w:pPr>
+            <w:r>
+              <w:rPr>
+                <w:rFonts w:ascii="Calibri" w:hAnsi="Calibri" w:cs="Arial"/>
+                <w:color w:val="000000" w:themeColor="text1"/>
+                <w:sz w:val="18"/>
+                <w:szCs w:val="18"/>
+              </w:rPr>
+              <w:t>0</w:t>
+            </w:r>
           </w:p>
         </w:tc>
         <w:tc>
@@ -4625,7 +4741,8 @@
           </w:tcPr>
           <w:p>
             <w:pPr>
-              <w:jc w:val="right"/>
+              <w:ind w:firstLine="0" w:left="0"/>
+              <w:jc w:val="center"/>
               <w:rPr>
                 <w:rFonts w:ascii="Calibri" w:hAnsi="Calibri" w:cs="Arial"/>
                 <w:color w:val="000000" w:themeColor="text1"/>
@@ -4633,6 +4750,15 @@
                 <w:szCs w:val="18"/>
               </w:rPr>
             </w:pPr>
+            <w:r>
+              <w:rPr>
+                <w:rFonts w:ascii="Calibri" w:hAnsi="Calibri" w:cs="Arial"/>
+                <w:color w:val="000000" w:themeColor="text1"/>
+                <w:sz w:val="18"/>
+                <w:szCs w:val="18"/>
+              </w:rPr>
+              <w:t>1</w:t>
+            </w:r>
           </w:p>
         </w:tc>
         <w:tc>
@@ -4650,7 +4776,8 @@
           </w:tcPr>
           <w:p>
             <w:pPr>
-              <w:jc w:val="right"/>
+              <w:ind w:firstLine="0" w:left="0"/>
+              <w:jc w:val="center"/>
               <w:rPr>
                 <w:rFonts w:ascii="Calibri" w:hAnsi="Calibri" w:cs="Arial"/>
                 <w:color w:val="000000" w:themeColor="text1"/>
@@ -4658,6 +4785,15 @@
                 <w:szCs w:val="18"/>
               </w:rPr>
             </w:pPr>
+            <w:r>
+              <w:rPr>
+                <w:rFonts w:ascii="Calibri" w:hAnsi="Calibri" w:cs="Arial"/>
+                <w:color w:val="000000" w:themeColor="text1"/>
+                <w:sz w:val="18"/>
+                <w:szCs w:val="18"/>
+              </w:rPr>
+              <w:t>0</w:t>
+            </w:r>
           </w:p>
         </w:tc>
         <w:tc>
@@ -4675,7 +4811,8 @@
           </w:tcPr>
           <w:p>
             <w:pPr>
-              <w:jc w:val="right"/>
+              <w:ind w:firstLine="0" w:left="0"/>
+              <w:jc w:val="center"/>
               <w:rPr>
                 <w:rFonts w:ascii="Calibri" w:hAnsi="Calibri" w:cs="Arial"/>
                 <w:color w:val="000000" w:themeColor="text1"/>
@@ -4683,6 +4820,15 @@
                 <w:szCs w:val="18"/>
               </w:rPr>
             </w:pPr>
+            <w:r>
+              <w:rPr>
+                <w:rFonts w:ascii="Calibri" w:hAnsi="Calibri" w:cs="Arial"/>
+                <w:color w:val="000000" w:themeColor="text1"/>
+                <w:sz w:val="18"/>
+                <w:szCs w:val="18"/>
+              </w:rPr>
+              <w:t>0</w:t>
+            </w:r>
           </w:p>
         </w:tc>
         <w:tc>
@@ -4700,6 +4846,7 @@
           </w:tcPr>
           <w:p>
             <w:pPr>
+              <w:ind w:firstLine="0" w:left="0"/>
               <w:jc w:val="center"/>
               <w:rPr>
                 <w:rFonts w:ascii="Calibri" w:hAnsi="Calibri" w:cs="Arial"/>
@@ -4708,6 +4855,15 @@
                 <w:szCs w:val="18"/>
               </w:rPr>
             </w:pPr>
+            <w:r>
+              <w:rPr>
+                <w:rFonts w:ascii="Calibri" w:hAnsi="Calibri" w:cs="Arial"/>
+                <w:color w:val="000000" w:themeColor="text1"/>
+                <w:sz w:val="18"/>
+                <w:szCs w:val="18"/>
+              </w:rPr>
+              <w:t>0</w:t>
+            </w:r>
           </w:p>
         </w:tc>
         <w:tc>
@@ -4725,7 +4881,8 @@
           </w:tcPr>
           <w:p>
             <w:pPr>
-              <w:jc w:val="right"/>
+              <w:ind w:firstLine="0" w:left="0"/>
+              <w:jc w:val="center"/>
               <w:rPr>
                 <w:rFonts w:ascii="Calibri" w:hAnsi="Calibri" w:cs="Arial"/>
                 <w:color w:val="000000" w:themeColor="text1"/>
@@ -4733,6 +4890,15 @@
                 <w:szCs w:val="18"/>
               </w:rPr>
             </w:pPr>
+            <w:r>
+              <w:rPr>
+                <w:rFonts w:ascii="Calibri" w:hAnsi="Calibri" w:cs="Arial"/>
+                <w:color w:val="000000" w:themeColor="text1"/>
+                <w:sz w:val="18"/>
+                <w:szCs w:val="18"/>
+              </w:rPr>
+              <w:t>0</w:t>
+            </w:r>
           </w:p>
         </w:tc>
         <w:tc>
@@ -4750,6 +4916,8 @@
           </w:tcPr>
           <w:p>
             <w:pPr>
+              <w:ind w:firstLine="0" w:left="0"/>
+              <w:jc w:val="center"/>
               <w:rPr>
                 <w:rFonts w:ascii="Calibri" w:hAnsi="Calibri" w:cs="Arial"/>
                 <w:color w:val="000000" w:themeColor="text1"/>
@@ -4757,6 +4925,15 @@
                 <w:szCs w:val="18"/>
               </w:rPr>
             </w:pPr>
+            <w:r>
+              <w:rPr>
+                <w:rFonts w:ascii="Calibri" w:hAnsi="Calibri" w:cs="Arial"/>
+                <w:color w:val="000000" w:themeColor="text1"/>
+                <w:sz w:val="18"/>
+                <w:szCs w:val="18"/>
+              </w:rPr>
+              <w:t>8</w:t>
+            </w:r>
           </w:p>
         </w:tc>
         <w:tc>
@@ -4774,6 +4951,7 @@
           </w:tcPr>
           <w:p>
             <w:pPr>
+              <w:ind w:firstLine="0" w:left="0"/>
               <w:jc w:val="center"/>
               <w:rPr>
                 <w:rFonts w:ascii="Calibri" w:hAnsi="Calibri" w:cs="Arial"/>
@@ -4789,7 +4967,7 @@
                 <w:sz w:val="18"/>
                 <w:szCs w:val="18"/>
               </w:rPr>
-              <w:t/>
+              <w:t>25</w:t>
             </w:r>
             <w:r>
               <w:rPr>
@@ -4817,6 +4995,7 @@
           </w:tcPr>
           <w:p>
             <w:pPr>
+              <w:ind w:firstLine="0" w:left="0"/>
               <w:jc w:val="center"/>
               <w:rPr>
                 <w:rFonts w:ascii="Calibri" w:hAnsi="Calibri" w:cs="Arial"/>
@@ -4825,6 +5004,15 @@
                 <w:szCs w:val="18"/>
               </w:rPr>
             </w:pPr>
+            <w:r>
+              <w:rPr>
+                <w:rFonts w:ascii="Calibri" w:hAnsi="Calibri" w:cs="Arial"/>
+                <w:color w:val="000000" w:themeColor="text1"/>
+                <w:sz w:val="18"/>
+                <w:szCs w:val="18"/>
+              </w:rPr>
+              <w:t>0</w:t>
+            </w:r>
           </w:p>
         </w:tc>
         <w:tc>
@@ -4842,6 +5030,7 @@
           </w:tcPr>
           <w:p>
             <w:pPr>
+              <w:ind w:firstLine="0" w:left="0"/>
               <w:jc w:val="center"/>
               <w:rPr>
                 <w:rFonts w:ascii="Calibri" w:hAnsi="Calibri" w:cs="Arial"/>
@@ -4857,7 +5046,7 @@
                 <w:sz w:val="18"/>
                 <w:szCs w:val="18"/>
               </w:rPr>
-              <w:t/>
+              <w:t>4</w:t>
             </w:r>
             <w:r>
               <w:rPr>
@@ -4885,7 +5074,8 @@
           </w:tcPr>
           <w:p>
             <w:pPr>
-              <w:jc w:val="right"/>
+              <w:ind w:firstLine="0" w:left="0"/>
+              <w:jc w:val="center"/>
               <w:rPr>
                 <w:rFonts w:ascii="Calibri" w:hAnsi="Calibri" w:cs="Arial"/>
                 <w:color w:val="000000" w:themeColor="text1"/>
@@ -4893,6 +5083,15 @@
                 <w:szCs w:val="18"/>
               </w:rPr>
             </w:pPr>
+            <w:r>
+              <w:rPr>
+                <w:rFonts w:ascii="Calibri" w:hAnsi="Calibri" w:cs="Arial"/>
+                <w:color w:val="000000" w:themeColor="text1"/>
+                <w:sz w:val="18"/>
+                <w:szCs w:val="18"/>
+              </w:rPr>
+              <w:t>0</w:t>
+            </w:r>
           </w:p>
         </w:tc>
         <w:tc>
@@ -4910,7 +5109,8 @@
           </w:tcPr>
           <w:p>
             <w:pPr>
-              <w:jc w:val="right"/>
+              <w:ind w:firstLine="0" w:left="0"/>
+              <w:jc w:val="center"/>
               <w:rPr>
                 <w:rFonts w:ascii="Calibri" w:hAnsi="Calibri" w:cs="Arial"/>
                 <w:color w:val="000000" w:themeColor="text1"/>
@@ -4918,6 +5118,15 @@
                 <w:szCs w:val="18"/>
               </w:rPr>
             </w:pPr>
+            <w:r>
+              <w:rPr>
+                <w:rFonts w:ascii="Calibri" w:hAnsi="Calibri" w:cs="Arial"/>
+                <w:color w:val="000000" w:themeColor="text1"/>
+                <w:sz w:val="18"/>
+                <w:szCs w:val="18"/>
+              </w:rPr>
+              <w:t>0</w:t>
+            </w:r>
           </w:p>
         </w:tc>
         <w:tc>
@@ -4935,7 +5144,8 @@
           </w:tcPr>
           <w:p>
             <w:pPr>
-              <w:jc w:val="right"/>
+              <w:ind w:firstLine="0" w:left="0"/>
+              <w:jc w:val="center"/>
               <w:rPr>
                 <w:rFonts w:ascii="Calibri" w:hAnsi="Calibri" w:cs="Arial"/>
                 <w:color w:val="000000" w:themeColor="text1"/>
@@ -4943,6 +5153,15 @@
                 <w:szCs w:val="18"/>
               </w:rPr>
             </w:pPr>
+            <w:r>
+              <w:rPr>
+                <w:rFonts w:ascii="Calibri" w:hAnsi="Calibri" w:cs="Arial"/>
+                <w:color w:val="000000" w:themeColor="text1"/>
+                <w:sz w:val="18"/>
+                <w:szCs w:val="18"/>
+              </w:rPr>
+              <w:t>0</w:t>
+            </w:r>
           </w:p>
         </w:tc>
         <w:tc>
@@ -4960,7 +5179,8 @@
           </w:tcPr>
           <w:p>
             <w:pPr>
-              <w:jc w:val="right"/>
+              <w:ind w:firstLine="0" w:left="0"/>
+              <w:jc w:val="center"/>
               <w:rPr>
                 <w:rFonts w:ascii="Calibri" w:hAnsi="Calibri" w:cs="Arial"/>
                 <w:color w:val="000000" w:themeColor="text1"/>
@@ -4968,6 +5188,15 @@
                 <w:szCs w:val="18"/>
               </w:rPr>
             </w:pPr>
+            <w:r>
+              <w:rPr>
+                <w:rFonts w:ascii="Calibri" w:hAnsi="Calibri" w:cs="Arial"/>
+                <w:color w:val="000000" w:themeColor="text1"/>
+                <w:sz w:val="18"/>
+                <w:szCs w:val="18"/>
+              </w:rPr>
+              <w:t>0</w:t>
+            </w:r>
           </w:p>
         </w:tc>
         <w:tc>
@@ -4985,7 +5214,8 @@
           </w:tcPr>
           <w:p>
             <w:pPr>
-              <w:jc w:val="right"/>
+              <w:ind w:firstLine="0" w:left="0"/>
+              <w:jc w:val="center"/>
               <w:rPr>
                 <w:rFonts w:ascii="Calibri" w:hAnsi="Calibri" w:cs="Arial"/>
                 <w:color w:val="000000" w:themeColor="text1"/>
@@ -4993,6 +5223,15 @@
                 <w:szCs w:val="18"/>
               </w:rPr>
             </w:pPr>
+            <w:r>
+              <w:rPr>
+                <w:rFonts w:ascii="Calibri" w:hAnsi="Calibri" w:cs="Arial"/>
+                <w:color w:val="000000" w:themeColor="text1"/>
+                <w:sz w:val="18"/>
+                <w:szCs w:val="18"/>
+              </w:rPr>
+              <w:t>0</w:t>
+            </w:r>
           </w:p>
         </w:tc>
         <w:tc>
@@ -5010,7 +5249,8 @@
           </w:tcPr>
           <w:p>
             <w:pPr>
-              <w:jc w:val="right"/>
+              <w:ind w:firstLine="0" w:left="0"/>
+              <w:jc w:val="center"/>
               <w:rPr>
                 <w:rFonts w:ascii="Calibri" w:hAnsi="Calibri" w:cs="Arial"/>
                 <w:color w:val="000000" w:themeColor="text1"/>
@@ -5018,6 +5258,15 @@
                 <w:szCs w:val="18"/>
               </w:rPr>
             </w:pPr>
+            <w:r>
+              <w:rPr>
+                <w:rFonts w:ascii="Calibri" w:hAnsi="Calibri" w:cs="Arial"/>
+                <w:color w:val="000000" w:themeColor="text1"/>
+                <w:sz w:val="18"/>
+                <w:szCs w:val="18"/>
+              </w:rPr>
+              <w:t>0</w:t>
+            </w:r>
           </w:p>
         </w:tc>
       </w:tr>

</xml_diff>